<commit_message>
feat: Optimiere Barcode-Label-Layout und erweitere Template-Support
ÄNDERUNGEN:

1. Barcode-Label Layout (barcode_generator.py):
   - Redesign: Artikel- und Lagernummer links, QR-Code rechts
   - Verbesserte Platznutzung für bessere Lesbarkeit
   - Optimierte QR-Code-Positionierung und Größenberechnung

2. Template-Erweiterungen:
   - Wareneingangskontrolle Template optimiert
   - Neue Placeholder 'chargennr' für Dateinamen hinzugefügt
   - Batch-Nummer-Support in GenerationContext erweitert

3. Konfiguration:
   - Vereinfachte Claude Code Berechtigungen

🤖 Generated with [Claude Code](https://claude.com/claude-code)

Co-Authored-By: Claude <noreply@anthropic.com>
</commit_message>
<xml_diff>
--- a/resources/templates/Fo0113_Wareneingangskontrolle.docx
+++ b/resources/templates/Fo0113_Wareneingangskontrolle.docx
@@ -174,27 +174,23 @@
       </w:tr>
       <w:tr>
         <w:trPr>
-          <w:trHeight w:val="772"/>
+          <w:trHeight w:val="807"/>
         </w:trPr>
         <w:tc>
           <w:tcPr>
             <w:tcW w:w="4106" w:type="dxa"/>
           </w:tcPr>
           <w:p>
-            <w:pPr>
-              <w:rPr>
-                <w:b/>
-                <w:sz w:val="28"/>
-                <w:szCs w:val="28"/>
-              </w:rPr>
-            </w:pPr>
-            <w:r>
-              <w:rPr>
-                <w:b/>
-                <w:sz w:val="28"/>
-                <w:szCs w:val="28"/>
-              </w:rPr>
-              <w:t xml:space="preserve">Pos. </w:t>
+            <w:r>
+              <w:rPr>
+                <w:b/>
+                <w:sz w:val="28"/>
+                <w:szCs w:val="28"/>
+              </w:rPr>
+              <w:t>Art.-Nr.:</w:t>
+            </w:r>
+            <w:r>
+              <w:t xml:space="preserve"> </w:t>
             </w:r>
           </w:p>
         </w:tc>
@@ -205,10 +201,33 @@
           <w:p>
             <w:pPr>
               <w:rPr>
-                <w:sz w:val="36"/>
-                <w:szCs w:val="36"/>
-              </w:rPr>
-            </w:pPr>
+                <w:sz w:val="28"/>
+                <w:szCs w:val="28"/>
+              </w:rPr>
+            </w:pPr>
+            <w:r>
+              <w:rPr>
+                <w:sz w:val="40"/>
+                <w:szCs w:val="40"/>
+              </w:rPr>
+              <w:t>[[</w:t>
+            </w:r>
+            <w:proofErr w:type="spellStart"/>
+            <w:r>
+              <w:rPr>
+                <w:sz w:val="40"/>
+                <w:szCs w:val="40"/>
+              </w:rPr>
+              <w:t>itemnr</w:t>
+            </w:r>
+            <w:proofErr w:type="spellEnd"/>
+            <w:r>
+              <w:rPr>
+                <w:sz w:val="40"/>
+                <w:szCs w:val="40"/>
+              </w:rPr>
+              <w:t>]]</w:t>
+            </w:r>
           </w:p>
         </w:tc>
       </w:tr>
@@ -221,65 +240,6 @@
             <w:tcW w:w="4106" w:type="dxa"/>
           </w:tcPr>
           <w:p>
-            <w:r>
-              <w:rPr>
-                <w:b/>
-                <w:sz w:val="28"/>
-                <w:szCs w:val="28"/>
-              </w:rPr>
-              <w:t>Art.-Nr.:</w:t>
-            </w:r>
-            <w:r>
-              <w:t xml:space="preserve"> </w:t>
-            </w:r>
-          </w:p>
-        </w:tc>
-        <w:tc>
-          <w:tcPr>
-            <w:tcW w:w="5569" w:type="dxa"/>
-          </w:tcPr>
-          <w:p>
-            <w:pPr>
-              <w:rPr>
-                <w:sz w:val="28"/>
-                <w:szCs w:val="28"/>
-              </w:rPr>
-            </w:pPr>
-            <w:r>
-              <w:rPr>
-                <w:sz w:val="40"/>
-                <w:szCs w:val="40"/>
-              </w:rPr>
-              <w:t>[[</w:t>
-            </w:r>
-            <w:proofErr w:type="spellStart"/>
-            <w:r>
-              <w:rPr>
-                <w:sz w:val="40"/>
-                <w:szCs w:val="40"/>
-              </w:rPr>
-              <w:t>itemnr</w:t>
-            </w:r>
-            <w:proofErr w:type="spellEnd"/>
-            <w:r>
-              <w:rPr>
-                <w:sz w:val="40"/>
-                <w:szCs w:val="40"/>
-              </w:rPr>
-              <w:t>]]</w:t>
-            </w:r>
-          </w:p>
-        </w:tc>
-      </w:tr>
-      <w:tr>
-        <w:trPr>
-          <w:trHeight w:val="807"/>
-        </w:trPr>
-        <w:tc>
-          <w:tcPr>
-            <w:tcW w:w="4106" w:type="dxa"/>
-          </w:tcPr>
-          <w:p>
             <w:pPr>
               <w:rPr>
                 <w:b/>
@@ -669,6 +629,45 @@
       <w:r>
         <w:tab/>
       </w:r>
+    </w:p>
+    <w:p/>
+    <w:p/>
+    <w:p/>
+    <w:p/>
+    <w:p/>
+    <w:p/>
+    <w:p/>
+    <w:p/>
+    <w:p/>
+    <w:p/>
+    <w:p/>
+    <w:p/>
+    <w:p/>
+    <w:p/>
+    <w:p/>
+    <w:p/>
+    <w:p/>
+    <w:p/>
+    <w:p/>
+    <w:p/>
+    <w:p/>
+    <w:p/>
+    <w:p/>
+    <w:p/>
+    <w:p/>
+    <w:p/>
+    <w:p/>
+    <w:p/>
+    <w:p/>
+    <w:p/>
+    <w:p/>
+    <w:p/>
+    <w:p/>
+    <w:p/>
+    <w:p>
+      <w:pPr>
+        <w:ind w:firstLine="708"/>
+      </w:pPr>
     </w:p>
     <w:sectPr>
       <w:headerReference w:type="default" r:id="rId6"/>
@@ -718,8 +717,8 @@
     </w:tblPr>
     <w:tblGrid>
       <w:gridCol w:w="3543"/>
-      <w:gridCol w:w="1627"/>
-      <w:gridCol w:w="2605"/>
+      <w:gridCol w:w="1277"/>
+      <w:gridCol w:w="2955"/>
       <w:gridCol w:w="1575"/>
     </w:tblGrid>
     <w:tr>
@@ -760,7 +759,7 @@
       </w:tc>
       <w:tc>
         <w:tcPr>
-          <w:tcW w:w="870" w:type="pct"/>
+          <w:tcW w:w="683" w:type="pct"/>
           <w:tcBorders>
             <w:top w:val="single" w:sz="4" w:space="0" w:color="000000" w:themeColor="text1"/>
             <w:left w:val="single" w:sz="4" w:space="0" w:color="000000" w:themeColor="text1"/>
@@ -801,7 +800,7 @@
       </w:tc>
       <w:tc>
         <w:tcPr>
-          <w:tcW w:w="1393" w:type="pct"/>
+          <w:tcW w:w="1580" w:type="pct"/>
           <w:tcBorders>
             <w:top w:val="single" w:sz="4" w:space="0" w:color="000000" w:themeColor="text1"/>
             <w:left w:val="single" w:sz="4" w:space="0" w:color="000000" w:themeColor="text1"/>
@@ -826,7 +825,31 @@
               <w:sz w:val="16"/>
               <w:szCs w:val="16"/>
             </w:rPr>
-            <w:t>Ausgabe/Version: 1 vom 12.07.2022</w:t>
+            <w:t xml:space="preserve">Ausgabe/Version: </w:t>
+          </w:r>
+          <w:r>
+            <w:rPr>
+              <w:rFonts w:ascii="Arial" w:hAnsi="Arial" w:cs="Arial"/>
+              <w:sz w:val="16"/>
+              <w:szCs w:val="16"/>
+            </w:rPr>
+            <w:t>2</w:t>
+          </w:r>
+          <w:r>
+            <w:rPr>
+              <w:rFonts w:ascii="Arial" w:hAnsi="Arial" w:cs="Arial"/>
+              <w:sz w:val="16"/>
+              <w:szCs w:val="16"/>
+            </w:rPr>
+            <w:t xml:space="preserve"> vom </w:t>
+          </w:r>
+          <w:r>
+            <w:rPr>
+              <w:rFonts w:ascii="Arial" w:hAnsi="Arial" w:cs="Arial"/>
+              <w:sz w:val="16"/>
+              <w:szCs w:val="16"/>
+            </w:rPr>
+            <w:t>06-11-2025</w:t>
           </w:r>
         </w:p>
       </w:tc>
@@ -855,7 +878,6 @@
               <w:docPartUnique/>
             </w:docPartObj>
           </w:sdtPr>
-          <w:sdtEndPr/>
           <w:sdtContent>
             <w:p>
               <w:pPr>

</xml_diff>

<commit_message>
fix: Optional-Import, Anthropic-Key-Laden und UI-Verbesserungen
- User View: Optional-Import hinzugefuegt (main_user_view.py)
- Environment Config: .env-Pfadberechnung korrigiert (5x parent statt 4x)
- Environment Config: load_dotenv mit override=True fuer zuverlaessiges Laden
- User App: .env-Pfad auf src_dir.parent korrigiert
- Login View: Fettschrift fuer Rollennamen in Dropdown
- Data Confirmation Popup: Ordnererstellung bei fehlendem Artikelordner
- Delivery Scan Popup: Robustere Ordnererstellung mit Fehlerbehandlung
- Document Storage: Optionale Ordnererstellung bei save_document
- Word Processor: Fettschrift-Bugfix in _process_measurement_table

🤖 Generated with [Claude Code](https://claude.com/claude-code)

Co-Authored-By: Claude <noreply@anthropic.com>
</commit_message>
<xml_diff>
--- a/resources/templates/Fo0113_Wareneingangskontrolle.docx
+++ b/resources/templates/Fo0113_Wareneingangskontrolle.docx
@@ -629,45 +629,6 @@
       <w:r>
         <w:tab/>
       </w:r>
-    </w:p>
-    <w:p/>
-    <w:p/>
-    <w:p/>
-    <w:p/>
-    <w:p/>
-    <w:p/>
-    <w:p/>
-    <w:p/>
-    <w:p/>
-    <w:p/>
-    <w:p/>
-    <w:p/>
-    <w:p/>
-    <w:p/>
-    <w:p/>
-    <w:p/>
-    <w:p/>
-    <w:p/>
-    <w:p/>
-    <w:p/>
-    <w:p/>
-    <w:p/>
-    <w:p/>
-    <w:p/>
-    <w:p/>
-    <w:p/>
-    <w:p/>
-    <w:p/>
-    <w:p/>
-    <w:p/>
-    <w:p/>
-    <w:p/>
-    <w:p/>
-    <w:p/>
-    <w:p>
-      <w:pPr>
-        <w:ind w:firstLine="708"/>
-      </w:pPr>
     </w:p>
     <w:sectPr>
       <w:headerReference w:type="default" r:id="rId6"/>
@@ -878,6 +839,7 @@
               <w:docPartUnique/>
             </w:docPartObj>
           </w:sdtPr>
+          <w:sdtEndPr/>
           <w:sdtContent>
             <w:p>
               <w:pPr>

</xml_diff>